<commit_message>
PB-11 SDS 14.3: Conditions and venue details design (M4, tracked changes)
Co-Authored-By: Claude Opus 5.5 <noreply@anthropic.com>
</commit_message>
<xml_diff>
--- a/docs/specs/StudySpot_SDS_v0.3_M1_tracked.docx
+++ b/docs/specs/StudySpot_SDS_v0.3_M1_tracked.docx
@@ -13357,6 +13357,627 @@
       <w:ins w:id="9213" w:author="Mohammad Kasaby (M1)" w:date="2026-10-25T20:30:00Z">
         <w:r>
           <w:t xml:space="preserve">This section holds the lower-level design of the Sprint 1 features. Each member adds their part before the Milestone 2 merge: Accounts and Auth class and sequence diagrams for registration and sign-in (M2); Venues and Search class diagram and the "nearby search with filters" sequence diagram (M3); Conditions class diagram and the "view details" sequence diagram (M4); the app's MVVM class diagram and screen flow (M5); screen designs (M6).</w:t>
+        </w:r>
+      </w:ins>
+    </w:p>
+    <w:p>
+      <w:pPr>
+        <w:pStyle w:val="Heading3"/>
+        <w:rPr>
+          <w:ins w:id="9502" w:author="Omar El-Gohary (M4)" w:date="2026-10-27T10:00:00Z"/>
+        </w:rPr>
+      </w:pPr>
+      <w:ins w:id="9501" w:author="Omar El-Gohary (M4)" w:date="2026-10-27T10:00:00Z">
+        <w:r>
+          <w:t xml:space="preserve">14.3 Conditions and venue details (M4)</w:t>
+        </w:r>
+      </w:ins>
+    </w:p>
+    <w:p>
+      <w:pPr>
+        <w:rPr>
+          <w:ins w:id="9505" w:author="Omar El-Gohary (M4)" w:date="2026-10-27T10:00:00Z"/>
+        </w:rPr>
+      </w:pPr>
+      <w:ins w:id="9503" w:author="Omar El-Gohary (M4)" w:date="2026-10-27T10:00:00Z">
+        <w:r>
+          <w:rPr>
+            <w:b/>
+          </w:rPr>
+          <w:t xml:space="preserve">What it does. </w:t>
+        </w:r>
+      </w:ins>
+      <w:ins w:id="9504" w:author="Omar El-Gohary (M4)" w:date="2026-10-27T10:00:00Z">
+        <w:r>
+          <w:t xml:space="preserve">Venue details (UC-04, PB-11, FR-016 to FR-021) return a venue in two separate groups (FR-019): the static information from the venue record, and the three dynamic values (crowd, noise, Wi-Fi) from the Conditions module, each with a status. The average rating and the number of reviews count only reviews a Moderator has not removed (FR-029); each review shows the author’s display name only (PRIV-014). A deactivated or unknown venue answers 404 NOT_FOUND with a message that says what to do next (USE-008). Other modules reach details only through the VenueQueryFacade (IVenueQuery), so StudyMatch will use the same values and labels.</w:t>
+        </w:r>
+      </w:ins>
+    </w:p>
+    <w:p>
+      <w:pPr>
+        <w:rPr>
+          <w:ins w:id="9508" w:author="Omar El-Gohary (M4)" w:date="2026-10-27T10:00:00Z"/>
+        </w:rPr>
+      </w:pPr>
+      <w:ins w:id="9506" w:author="Omar El-Gohary (M4)" w:date="2026-10-27T10:00:00Z">
+        <w:r>
+          <w:rPr>
+            <w:b/>
+          </w:rPr>
+          <w:t xml:space="preserve">Class design (Figure 14.3a). </w:t>
+        </w:r>
+      </w:ins>
+      <w:ins w:id="9507" w:author="Omar El-Gohary (M4)" w:date="2026-10-27T10:00:00Z">
+        <w:r>
+          <w:t xml:space="preserve">ConditionsService implements IConditions. For the venues it is asked about, it reads the dynamic records of the last 90 days in one query (records of removed surveys are left out), the venue size class, and the present-user count from IPresence, and asks ConditionResolver to resolve crowd, noise and Wi-Fi. ConditionResolver is the Chain of Responsibility of Section 8, built once: CurrentHandler → HoursAgoHandler → HistoricalHandler → UnavailableHandler. Each handler extends the abstract ConditionHandler and either returns a ConditionValue or passes the request to the next handler; UnavailableHandler always answers. The fallback order of SRS 3.9 is therefore written in one place (RT-014, RT-018), and a new status can be added without changing the callers. The combining rules of 6.6.1 to 6.6.3 (weights, newest answer per user, rounding, crowd thresholds, record sets in Cairo time, median) are pure functions in condition-rules, so each rule is tested at its boundaries without a database. Every limit is read from IConfig and the time from IClock (Section 9, testability). Table 14.3 lists what each handler does.</w:t>
+        </w:r>
+      </w:ins>
+    </w:p>
+    <w:p>
+      <w:pPr>
+        <w:keepNext/>
+        <w:rPr>
+          <w:ins w:id="9511" w:author="Omar El-Gohary (M4)" w:date="2026-10-27T10:00:00Z"/>
+        </w:rPr>
+      </w:pPr>
+      <w:ins w:id="9509" w:author="Omar El-Gohary (M4)" w:date="2026-10-27T10:00:00Z">
+        <w:r>
+          <w:rPr>
+            <w:b/>
+            <w:sz w:val="19"/>
+          </w:rPr>
+          <w:t xml:space="preserve">Table 14.3. </w:t>
+        </w:r>
+      </w:ins>
+      <w:ins w:id="9510" w:author="Omar El-Gohary (M4)" w:date="2026-10-27T10:00:00Z">
+        <w:r>
+          <w:rPr>
+            <w:i/>
+            <w:sz w:val="19"/>
+          </w:rPr>
+          <w:t xml:space="preserve">Conditions resolution: the handlers of the chain, in order</w:t>
+        </w:r>
+      </w:ins>
+    </w:p>
+    <w:tbl>
+      <w:tblPr>
+        <w:tblStyle w:val="TableGrid"/>
+        <w:tblW w:w="0" w:type="auto"/>
+        <w:tblLayout w:type="fixed"/>
+        <w:tblLook w:val="0420" w:firstRow="1" w:lastRow="0" w:firstColumn="0" w:lastColumn="0" w:noHBand="0" w:noVBand="1"/>
+      </w:tblPr>
+      <w:tblGrid>
+        <w:gridCol w:w="1700"/>
+        <w:gridCol w:w="2600"/>
+        <w:gridCol w:w="3260"/>
+        <w:gridCol w:w="1800"/>
+      </w:tblGrid>
+      <w:tr>
+        <w:trPr>
+          <w:tblHeader/>
+          <w:ins w:id="9512" w:author="Omar El-Gohary (M4)" w:date="2026-10-27T10:00:00Z"/>
+        </w:trPr>
+        <w:tc>
+          <w:tcPr>
+            <w:tcW w:w="1700" w:type="dxa"/>
+            <w:shd w:val="clear" w:color="auto" w:fill="F2F2F2"/>
+          </w:tcPr>
+          <w:p>
+            <w:pPr>
+              <w:rPr>
+                <w:ins w:id="9514" w:author="Omar El-Gohary (M4)" w:date="2026-10-27T10:00:00Z"/>
+              </w:rPr>
+            </w:pPr>
+            <w:ins w:id="9513" w:author="Omar El-Gohary (M4)" w:date="2026-10-27T10:00:00Z">
+              <w:r>
+                <w:rPr>
+                  <w:b/>
+                </w:rPr>
+                <w:t xml:space="preserve">Handler</w:t>
+              </w:r>
+            </w:ins>
+          </w:p>
+        </w:tc>
+        <w:tc>
+          <w:tcPr>
+            <w:tcW w:w="2600" w:type="dxa"/>
+            <w:shd w:val="clear" w:color="auto" w:fill="F2F2F2"/>
+          </w:tcPr>
+          <w:p>
+            <w:pPr>
+              <w:rPr>
+                <w:ins w:id="9516" w:author="Omar El-Gohary (M4)" w:date="2026-10-27T10:00:00Z"/>
+              </w:rPr>
+            </w:pPr>
+            <w:ins w:id="9515" w:author="Omar El-Gohary (M4)" w:date="2026-10-27T10:00:00Z">
+              <w:r>
+                <w:rPr>
+                  <w:b/>
+                </w:rPr>
+                <w:t xml:space="preserve">Answers when</w:t>
+              </w:r>
+            </w:ins>
+          </w:p>
+        </w:tc>
+        <w:tc>
+          <w:tcPr>
+            <w:tcW w:w="3260" w:type="dxa"/>
+            <w:shd w:val="clear" w:color="auto" w:fill="F2F2F2"/>
+          </w:tcPr>
+          <w:p>
+            <w:pPr>
+              <w:rPr>
+                <w:ins w:id="9518" w:author="Omar El-Gohary (M4)" w:date="2026-10-27T10:00:00Z"/>
+              </w:rPr>
+            </w:pPr>
+            <w:ins w:id="9517" w:author="Omar El-Gohary (M4)" w:date="2026-10-27T10:00:00Z">
+              <w:r>
+                <w:rPr>
+                  <w:b/>
+                </w:rPr>
+                <w:t xml:space="preserve">Value</w:t>
+              </w:r>
+            </w:ins>
+          </w:p>
+        </w:tc>
+        <w:tc>
+          <w:tcPr>
+            <w:tcW w:w="1800" w:type="dxa"/>
+            <w:shd w:val="clear" w:color="auto" w:fill="F2F2F2"/>
+          </w:tcPr>
+          <w:p>
+            <w:pPr>
+              <w:rPr>
+                <w:ins w:id="9520" w:author="Omar El-Gohary (M4)" w:date="2026-10-27T10:00:00Z"/>
+              </w:rPr>
+            </w:pPr>
+            <w:ins w:id="9519" w:author="Omar El-Gohary (M4)" w:date="2026-10-27T10:00:00Z">
+              <w:r>
+                <w:rPr>
+                  <w:b/>
+                </w:rPr>
+                <w:t xml:space="preserve">Label in the app</w:t>
+              </w:r>
+            </w:ins>
+          </w:p>
+        </w:tc>
+      </w:tr>
+      <w:tr>
+        <w:trPr>
+          <w:ins w:id="9521" w:author="Omar El-Gohary (M4)" w:date="2026-10-27T10:00:00Z"/>
+        </w:trPr>
+        <w:tc>
+          <w:tcPr>
+            <w:tcW w:w="1700" w:type="dxa"/>
+          </w:tcPr>
+          <w:p>
+            <w:pPr>
+              <w:rPr>
+                <w:ins w:id="9523" w:author="Omar El-Gohary (M4)" w:date="2026-10-27T10:00:00Z"/>
+              </w:rPr>
+            </w:pPr>
+            <w:ins w:id="9522" w:author="Omar El-Gohary (M4)" w:date="2026-10-27T10:00:00Z">
+              <w:r>
+                <w:t xml:space="preserve">CurrentHandler</w:t>
+              </w:r>
+            </w:ins>
+          </w:p>
+        </w:tc>
+        <w:tc>
+          <w:tcPr>
+            <w:tcW w:w="2600" w:type="dxa"/>
+          </w:tcPr>
+          <w:p>
+            <w:pPr>
+              <w:rPr>
+                <w:ins w:id="9525" w:author="Omar El-Gohary (M4)" w:date="2026-10-27T10:00:00Z"/>
+              </w:rPr>
+            </w:pPr>
+            <w:ins w:id="9524" w:author="Omar El-Gohary (M4)" w:date="2026-10-27T10:00:00Z">
+              <w:r>
+                <w:t xml:space="preserve">An input is within the freshness limit: 60 min for crowd and noise, 6 h for Wi-Fi (RT-001); or users are present (crowd).</w:t>
+              </w:r>
+            </w:ins>
+          </w:p>
+        </w:tc>
+        <w:tc>
+          <w:tcPr>
+            <w:tcW w:w="3260" w:type="dxa"/>
+          </w:tcPr>
+          <w:p>
+            <w:pPr>
+              <w:rPr>
+                <w:ins w:id="9527" w:author="Omar El-Gohary (M4)" w:date="2026-10-27T10:00:00Z"/>
+              </w:rPr>
+            </w:pPr>
+            <w:ins w:id="9526" w:author="Omar El-Gohary (M4)" w:date="2026-10-27T10:00:00Z">
+              <w:r>
+                <w:t xml:space="preserve">Weighted average of the newest answer of each user, audio weight 2, a half rounds up. Crowd is the higher of the present-user level and the survey level (6.6.1, 6.6.2).</w:t>
+              </w:r>
+            </w:ins>
+          </w:p>
+        </w:tc>
+        <w:tc>
+          <w:tcPr>
+            <w:tcW w:w="1800" w:type="dxa"/>
+          </w:tcPr>
+          <w:p>
+            <w:pPr>
+              <w:rPr>
+                <w:ins w:id="9529" w:author="Omar El-Gohary (M4)" w:date="2026-10-27T10:00:00Z"/>
+              </w:rPr>
+            </w:pPr>
+            <w:ins w:id="9528" w:author="Omar El-Gohary (M4)" w:date="2026-10-27T10:00:00Z">
+              <w:r>
+                <w:t xml:space="preserve">Current</w:t>
+              </w:r>
+            </w:ins>
+          </w:p>
+        </w:tc>
+      </w:tr>
+      <w:tr>
+        <w:trPr>
+          <w:ins w:id="9530" w:author="Omar El-Gohary (M4)" w:date="2026-10-27T10:00:00Z"/>
+        </w:trPr>
+        <w:tc>
+          <w:tcPr>
+            <w:tcW w:w="1700" w:type="dxa"/>
+          </w:tcPr>
+          <w:p>
+            <w:pPr>
+              <w:rPr>
+                <w:ins w:id="9532" w:author="Omar El-Gohary (M4)" w:date="2026-10-27T10:00:00Z"/>
+              </w:rPr>
+            </w:pPr>
+            <w:ins w:id="9531" w:author="Omar El-Gohary (M4)" w:date="2026-10-27T10:00:00Z">
+              <w:r>
+                <w:t xml:space="preserve">HoursAgoHandler</w:t>
+              </w:r>
+            </w:ins>
+          </w:p>
+        </w:tc>
+        <w:tc>
+          <w:tcPr>
+            <w:tcW w:w="2600" w:type="dxa"/>
+          </w:tcPr>
+          <w:p>
+            <w:pPr>
+              <w:rPr>
+                <w:ins w:id="9534" w:author="Omar El-Gohary (M4)" w:date="2026-10-27T10:00:00Z"/>
+              </w:rPr>
+            </w:pPr>
+            <w:ins w:id="9533" w:author="Omar El-Gohary (M4)" w:date="2026-10-27T10:00:00Z">
+              <w:r>
+                <w:t xml:space="preserve">The newest input is less than 24 hours old (RT-016).</w:t>
+              </w:r>
+            </w:ins>
+          </w:p>
+        </w:tc>
+        <w:tc>
+          <w:tcPr>
+            <w:tcW w:w="3260" w:type="dxa"/>
+          </w:tcPr>
+          <w:p>
+            <w:pPr>
+              <w:rPr>
+                <w:ins w:id="9536" w:author="Omar El-Gohary (M4)" w:date="2026-10-27T10:00:00Z"/>
+              </w:rPr>
+            </w:pPr>
+            <w:ins w:id="9535" w:author="Omar El-Gohary (M4)" w:date="2026-10-27T10:00:00Z">
+              <w:r>
+                <w:t xml:space="preserve">The same rule, on the inputs within one freshness window before the newest input.</w:t>
+              </w:r>
+            </w:ins>
+          </w:p>
+        </w:tc>
+        <w:tc>
+          <w:tcPr>
+            <w:tcW w:w="1800" w:type="dxa"/>
+          </w:tcPr>
+          <w:p>
+            <w:pPr>
+              <w:rPr>
+                <w:ins w:id="9538" w:author="Omar El-Gohary (M4)" w:date="2026-10-27T10:00:00Z"/>
+              </w:rPr>
+            </w:pPr>
+            <w:ins w:id="9537" w:author="Omar El-Gohary (M4)" w:date="2026-10-27T10:00:00Z">
+              <w:r>
+                <w:t xml:space="preserve">X hours ago (from newestInputAt)</w:t>
+              </w:r>
+            </w:ins>
+          </w:p>
+        </w:tc>
+      </w:tr>
+      <w:tr>
+        <w:trPr>
+          <w:ins w:id="9539" w:author="Omar El-Gohary (M4)" w:date="2026-10-27T10:00:00Z"/>
+        </w:trPr>
+        <w:tc>
+          <w:tcPr>
+            <w:tcW w:w="1700" w:type="dxa"/>
+          </w:tcPr>
+          <w:p>
+            <w:pPr>
+              <w:rPr>
+                <w:ins w:id="9541" w:author="Omar El-Gohary (M4)" w:date="2026-10-27T10:00:00Z"/>
+              </w:rPr>
+            </w:pPr>
+            <w:ins w:id="9540" w:author="Omar El-Gohary (M4)" w:date="2026-10-27T10:00:00Z">
+              <w:r>
+                <w:t xml:space="preserve">HistoricalHandler</w:t>
+              </w:r>
+            </w:ins>
+          </w:p>
+        </w:tc>
+        <w:tc>
+          <w:tcPr>
+            <w:tcW w:w="2600" w:type="dxa"/>
+          </w:tcPr>
+          <w:p>
+            <w:pPr>
+              <w:rPr>
+                <w:ins w:id="9543" w:author="Omar El-Gohary (M4)" w:date="2026-10-27T10:00:00Z"/>
+              </w:rPr>
+            </w:pPr>
+            <w:ins w:id="9542" w:author="Omar El-Gohary (M4)" w:date="2026-10-27T10:00:00Z">
+              <w:r>
+                <w:t xml:space="preserve">There is any record in the last 90 days (RT-017).</w:t>
+              </w:r>
+            </w:ins>
+          </w:p>
+        </w:tc>
+        <w:tc>
+          <w:tcPr>
+            <w:tcW w:w="3260" w:type="dxa"/>
+          </w:tcPr>
+          <w:p>
+            <w:pPr>
+              <w:rPr>
+                <w:ins w:id="9545" w:author="Omar El-Gohary (M4)" w:date="2026-10-27T10:00:00Z"/>
+              </w:rPr>
+            </w:pPr>
+            <w:ins w:id="9544" w:author="Omar El-Gohary (M4)" w:date="2026-10-27T10:00:00Z">
+              <w:r>
+                <w:t xml:space="preserve">Weighted median, ties go to the higher level, on the first set with at least 3 records: same weekday and hour; same day type within one hour; all records (6.6.3).</w:t>
+              </w:r>
+            </w:ins>
+          </w:p>
+        </w:tc>
+        <w:tc>
+          <w:tcPr>
+            <w:tcW w:w="1800" w:type="dxa"/>
+          </w:tcPr>
+          <w:p>
+            <w:pPr>
+              <w:rPr>
+                <w:ins w:id="9547" w:author="Omar El-Gohary (M4)" w:date="2026-10-27T10:00:00Z"/>
+              </w:rPr>
+            </w:pPr>
+            <w:ins w:id="9546" w:author="Omar El-Gohary (M4)" w:date="2026-10-27T10:00:00Z">
+              <w:r>
+                <w:t xml:space="preserve">Estimate based on historical data</w:t>
+              </w:r>
+            </w:ins>
+          </w:p>
+        </w:tc>
+      </w:tr>
+      <w:tr>
+        <w:trPr>
+          <w:ins w:id="9548" w:author="Omar El-Gohary (M4)" w:date="2026-10-27T10:00:00Z"/>
+        </w:trPr>
+        <w:tc>
+          <w:tcPr>
+            <w:tcW w:w="1700" w:type="dxa"/>
+          </w:tcPr>
+          <w:p>
+            <w:pPr>
+              <w:rPr>
+                <w:ins w:id="9550" w:author="Omar El-Gohary (M4)" w:date="2026-10-27T10:00:00Z"/>
+              </w:rPr>
+            </w:pPr>
+            <w:ins w:id="9549" w:author="Omar El-Gohary (M4)" w:date="2026-10-27T10:00:00Z">
+              <w:r>
+                <w:t xml:space="preserve">UnavailableHandler</w:t>
+              </w:r>
+            </w:ins>
+          </w:p>
+        </w:tc>
+        <w:tc>
+          <w:tcPr>
+            <w:tcW w:w="2600" w:type="dxa"/>
+          </w:tcPr>
+          <w:p>
+            <w:pPr>
+              <w:rPr>
+                <w:ins w:id="9552" w:author="Omar El-Gohary (M4)" w:date="2026-10-27T10:00:00Z"/>
+              </w:rPr>
+            </w:pPr>
+            <w:ins w:id="9551" w:author="Omar El-Gohary (M4)" w:date="2026-10-27T10:00:00Z">
+              <w:r>
+                <w:t xml:space="preserve">Always (last in the chain).</w:t>
+              </w:r>
+            </w:ins>
+          </w:p>
+        </w:tc>
+        <w:tc>
+          <w:tcPr>
+            <w:tcW w:w="3260" w:type="dxa"/>
+          </w:tcPr>
+          <w:p>
+            <w:pPr>
+              <w:rPr>
+                <w:ins w:id="9554" w:author="Omar El-Gohary (M4)" w:date="2026-10-27T10:00:00Z"/>
+              </w:rPr>
+            </w:pPr>
+            <w:ins w:id="9553" w:author="Omar El-Gohary (M4)" w:date="2026-10-27T10:00:00Z">
+              <w:r>
+                <w:t xml:space="preserve">No level (RT-018, FR-021).</w:t>
+              </w:r>
+            </w:ins>
+          </w:p>
+        </w:tc>
+        <w:tc>
+          <w:tcPr>
+            <w:tcW w:w="1800" w:type="dxa"/>
+          </w:tcPr>
+          <w:p>
+            <w:pPr>
+              <w:rPr>
+                <w:ins w:id="9556" w:author="Omar El-Gohary (M4)" w:date="2026-10-27T10:00:00Z"/>
+              </w:rPr>
+            </w:pPr>
+            <w:ins w:id="9555" w:author="Omar El-Gohary (M4)" w:date="2026-10-27T10:00:00Z">
+              <w:r>
+                <w:t xml:space="preserve">Unavailable</w:t>
+              </w:r>
+            </w:ins>
+          </w:p>
+        </w:tc>
+      </w:tr>
+    </w:tbl>
+    <w:p>
+      <w:pPr>
+        <w:rPr>
+          <w:ins w:id="9559" w:author="Omar El-Gohary (M4)" w:date="2026-10-27T10:00:00Z"/>
+        </w:rPr>
+      </w:pPr>
+      <w:ins w:id="9557" w:author="Omar El-Gohary (M4)" w:date="2026-10-27T10:00:00Z">
+        <w:r>
+          <w:rPr>
+            <w:b/>
+          </w:rPr>
+          <w:t xml:space="preserve">Caching and events. </w:t>
+        </w:r>
+      </w:ins>
+      <w:ins w:id="9558" w:author="Omar El-Gohary (M4)" w:date="2026-10-27T10:00:00Z">
+        <w:r>
+          <w:t xml:space="preserve">Resolved values are cached for conditions.cacheSeconds (60 s, RT-006). A SurveyStored or NoiseRecorded event drops the venue’s entry, so a new survey shows at once (PERF-005); a ConfigChanged event drops the whole cache, so a changed limit applies immediately. The Scheduler calls purgeExpiredRecords every night to delete records older than 90 days (PRIV-013).</w:t>
+        </w:r>
+      </w:ins>
+    </w:p>
+    <w:p>
+      <w:pPr>
+        <w:keepNext/>
+        <w:jc w:val="center"/>
+        <w:rPr>
+          <w:ins w:id="9561" w:author="Omar El-Gohary (M4)" w:date="2026-10-27T10:00:00Z"/>
+        </w:rPr>
+      </w:pPr>
+      <w:ins w:id="9560" w:author="Omar El-Gohary (M4)" w:date="2026-10-27T10:00:00Z">
+        <w:r>
+          <w:rPr>
+            <w:i/>
+          </w:rPr>
+          <w:t xml:space="preserve">[Figure to insert: render docs/architecture/uml/conditions-class.puml]</w:t>
+        </w:r>
+      </w:ins>
+    </w:p>
+    <w:p>
+      <w:pPr>
+        <w:jc w:val="center"/>
+        <w:rPr>
+          <w:ins w:id="9564" w:author="Omar El-Gohary (M4)" w:date="2026-10-27T10:00:00Z"/>
+        </w:rPr>
+      </w:pPr>
+      <w:ins w:id="9562" w:author="Omar El-Gohary (M4)" w:date="2026-10-27T10:00:00Z">
+        <w:r>
+          <w:rPr>
+            <w:b/>
+            <w:sz w:val="19"/>
+          </w:rPr>
+          <w:t xml:space="preserve">Figure 14.3a. </w:t>
+        </w:r>
+      </w:ins>
+      <w:ins w:id="9563" w:author="Omar El-Gohary (M4)" w:date="2026-10-27T10:00:00Z">
+        <w:r>
+          <w:rPr>
+            <w:i/>
+            <w:sz w:val="19"/>
+          </w:rPr>
+          <w:t xml:space="preserve">Conditions and venue details class diagram (source: docs/architecture/uml/conditions-class.puml).</w:t>
+        </w:r>
+      </w:ins>
+    </w:p>
+    <w:p>
+      <w:pPr>
+        <w:rPr>
+          <w:ins w:id="9567" w:author="Omar El-Gohary (M4)" w:date="2026-10-27T10:00:00Z"/>
+        </w:rPr>
+      </w:pPr>
+      <w:ins w:id="9565" w:author="Omar El-Gohary (M4)" w:date="2026-10-27T10:00:00Z">
+        <w:r>
+          <w:rPr>
+            <w:b/>
+          </w:rPr>
+          <w:t xml:space="preserve">View details sequence (Figure 14.3b). </w:t>
+        </w:r>
+      </w:ins>
+      <w:ins w:id="9566" w:author="Omar El-Gohary (M4)" w:date="2026-10-27T10:00:00Z">
+        <w:r>
+          <w:t xml:space="preserve">The app calls GET /api/v1/venues/{venueId}. The API Layer checks the ID (400 INVALID_INPUT if it is not a UUID) and calls VenueQueryFacade, which delegates to VenueDetailsService. The service reads the active venue (404 if none), then in parallel the rating summary, the 20 newest visible reviews, and the conditions. ConditionsService answers from its cache, or loads the records, the size class and the present-user count and runs the chain once per value. The app turns each status into its label: "Current", "X hours ago", "Estimate based on historical data" or "Unavailable"; crowd and noise are also marked as estimates (USE-004).</w:t>
+        </w:r>
+      </w:ins>
+    </w:p>
+    <w:p>
+      <w:pPr>
+        <w:keepNext/>
+        <w:jc w:val="center"/>
+        <w:rPr>
+          <w:ins w:id="9569" w:author="Omar El-Gohary (M4)" w:date="2026-10-27T10:00:00Z"/>
+        </w:rPr>
+      </w:pPr>
+      <w:ins w:id="9568" w:author="Omar El-Gohary (M4)" w:date="2026-10-27T10:00:00Z">
+        <w:r>
+          <w:rPr>
+            <w:i/>
+          </w:rPr>
+          <w:t xml:space="preserve">[Figure to insert: render docs/architecture/uml/view-details-sequence.puml]</w:t>
+        </w:r>
+      </w:ins>
+    </w:p>
+    <w:p>
+      <w:pPr>
+        <w:jc w:val="center"/>
+        <w:rPr>
+          <w:ins w:id="9572" w:author="Omar El-Gohary (M4)" w:date="2026-10-27T10:00:00Z"/>
+        </w:rPr>
+      </w:pPr>
+      <w:ins w:id="9570" w:author="Omar El-Gohary (M4)" w:date="2026-10-27T10:00:00Z">
+        <w:r>
+          <w:rPr>
+            <w:b/>
+            <w:sz w:val="19"/>
+          </w:rPr>
+          <w:t xml:space="preserve">Figure 14.3b. </w:t>
+        </w:r>
+      </w:ins>
+      <w:ins w:id="9571" w:author="Omar El-Gohary (M4)" w:date="2026-10-27T10:00:00Z">
+        <w:r>
+          <w:rPr>
+            <w:i/>
+            <w:sz w:val="19"/>
+          </w:rPr>
+          <w:t xml:space="preserve">"View details" sequence diagram (UC-04) (source: docs/architecture/uml/view-details-sequence.puml).</w:t>
+        </w:r>
+      </w:ins>
+    </w:p>
+    <w:p>
+      <w:pPr>
+        <w:rPr>
+          <w:ins w:id="9575" w:author="Omar El-Gohary (M4)" w:date="2026-10-27T10:00:00Z"/>
+        </w:rPr>
+      </w:pPr>
+      <w:ins w:id="9573" w:author="Omar El-Gohary (M4)" w:date="2026-10-27T10:00:00Z">
+        <w:r>
+          <w:rPr>
+            <w:b/>
+          </w:rPr>
+          <w:t xml:space="preserve">Demo data and tests. </w:t>
+        </w:r>
+      </w:ins>
+      <w:ins w:id="9574" w:author="Omar El-Gohary (M4)" w:date="2026-10-27T10:00:00Z">
+        <w:r>
+          <w:t xml:space="preserve">backend/seed/records.json holds 90 days of sample survey and audio inputs; the seed moves them to the day it is loaded, so the sample venues show every status in the demo. Test cases TC-M4-01 to TC-M4-15 (docs/testing/test-cases.csv) cover each rule at its boundaries (59 and 61 minutes, 23 h 59 and 24 h 1, 6 hours, size-class thresholds, the three record sets) and the details endpoint on a real database.</w:t>
         </w:r>
       </w:ins>
     </w:p>

</xml_diff>

<commit_message>
SCRUM-23 SCRUM-29 Render M4 diagrams and add them to SDS 14.3
Class diagram re-laid out to fit a page; render with -charset UTF-8 so the
guillemets and +- show correctly.

Co-Authored-By: Claude Opus 5.5 <noreply@anthropic.com>
</commit_message>
<xml_diff>
--- a/docs/specs/StudySpot_SDS_v0.3_M1_tracked.docx
+++ b/docs/specs/StudySpot_SDS_v0.3_M1_tracked.docx
@@ -13863,12 +13863,44 @@
           <w:ins w:id="9561" w:author="Omar El-Gohary (M4)" w:date="2026-10-27T10:00:00Z"/>
         </w:rPr>
       </w:pPr>
-      <w:ins w:id="9560" w:author="Omar El-Gohary (M4)" w:date="2026-10-27T10:00:00Z">
+      <w:ins w:id="9701" w:author="Omar El-Gohary (M4)" w:date="2026-10-27T19:00:00Z">
         <w:r>
           <w:rPr>
-            <w:i/>
+            <w:noProof/>
           </w:rPr>
-          <w:t xml:space="preserve">[Figure to insert: render docs/architecture/uml/conditions-class.puml]</w:t>
+          <w:drawing>
+            <wp:inline distT="0" distB="0" distL="0" distR="0">
+              <wp:extent cx="5943600" cy="5053252"/>
+              <wp:effectExtent l="0" t="0" r="0" b="0"/>
+              <wp:docPr id="950" name="m4_conditions-class.png" descr="Conditions class diagram"/>
+              <wp:cNvGraphicFramePr/>
+              <a:graphic xmlns:a="http://schemas.openxmlformats.org/drawingml/2006/main">
+                <a:graphicData uri="http://schemas.openxmlformats.org/drawingml/2006/picture">
+                  <pic:pic xmlns:pic="http://schemas.openxmlformats.org/drawingml/2006/picture">
+                    <pic:nvPicPr>
+                      <pic:cNvPr id="950" name="m4_conditions-class.png" descr="Conditions class diagram"/>
+                      <pic:cNvPicPr/>
+                    </pic:nvPicPr>
+                    <pic:blipFill>
+                      <a:blip r:embed="rIdM4950"/>
+                      <a:stretch>
+                        <a:fillRect/>
+                      </a:stretch>
+                    </pic:blipFill>
+                    <pic:spPr>
+                      <a:xfrm>
+                        <a:off x="0" y="0"/>
+                        <a:ext cx="5943600" cy="5053252"/>
+                      </a:xfrm>
+                      <a:prstGeom prst="rect">
+                        <a:avLst/>
+                      </a:prstGeom>
+                    </pic:spPr>
+                  </pic:pic>
+                </a:graphicData>
+              </a:graphic>
+            </wp:inline>
+          </w:drawing>
         </w:r>
       </w:ins>
     </w:p>
@@ -13926,12 +13958,44 @@
           <w:ins w:id="9569" w:author="Omar El-Gohary (M4)" w:date="2026-10-27T10:00:00Z"/>
         </w:rPr>
       </w:pPr>
-      <w:ins w:id="9568" w:author="Omar El-Gohary (M4)" w:date="2026-10-27T10:00:00Z">
+      <w:ins w:id="9702" w:author="Omar El-Gohary (M4)" w:date="2026-10-27T19:00:00Z">
         <w:r>
           <w:rPr>
-            <w:i/>
+            <w:noProof/>
           </w:rPr>
-          <w:t xml:space="preserve">[Figure to insert: render docs/architecture/uml/view-details-sequence.puml]</w:t>
+          <w:drawing>
+            <wp:inline distT="0" distB="0" distL="0" distR="0">
+              <wp:extent cx="5943600" cy="4042198"/>
+              <wp:effectExtent l="0" t="0" r="0" b="0"/>
+              <wp:docPr id="951" name="m4_view-details-sequence.png" descr="View details sequence diagram"/>
+              <wp:cNvGraphicFramePr/>
+              <a:graphic xmlns:a="http://schemas.openxmlformats.org/drawingml/2006/main">
+                <a:graphicData uri="http://schemas.openxmlformats.org/drawingml/2006/picture">
+                  <pic:pic xmlns:pic="http://schemas.openxmlformats.org/drawingml/2006/picture">
+                    <pic:nvPicPr>
+                      <pic:cNvPr id="951" name="m4_view-details-sequence.png" descr="View details sequence diagram"/>
+                      <pic:cNvPicPr/>
+                    </pic:nvPicPr>
+                    <pic:blipFill>
+                      <a:blip r:embed="rIdM4951"/>
+                      <a:stretch>
+                        <a:fillRect/>
+                      </a:stretch>
+                    </pic:blipFill>
+                    <pic:spPr>
+                      <a:xfrm>
+                        <a:off x="0" y="0"/>
+                        <a:ext cx="5943600" cy="4042198"/>
+                      </a:xfrm>
+                      <a:prstGeom prst="rect">
+                        <a:avLst/>
+                      </a:prstGeom>
+                    </pic:spPr>
+                  </pic:pic>
+                </a:graphicData>
+              </a:graphic>
+            </wp:inline>
+          </w:drawing>
         </w:r>
       </w:ins>
     </w:p>

</xml_diff>